<commit_message>
Sigma^2 audit vetoes 3-path; final = physically sound 2-shell
- 3-path Rf 0.0128 was an illusion: sigma^2 collapsed to 2e-10 +/- 0.28
  (overparameterization red flag); with sigma^2 pinned to physical
  values the mixed-shell C amplitude dies (CN=0.00) - data supports
  two-shell, not mixed first shell
- FINAL deliverable: two-shell (Pt-N 2.4@1.99 + C 1.3@2.93, sigma^2
  0.0027/0.0013 physical, Rf 0.0169, Re-chi(R) corr 0.994); opju and
  report reverted to recipe 10 fit
- lesson codified: lowest Rf != best fit; audit parameter physicality
  before ranking models
</commit_message>
<xml_diff>
--- a/skills/sci-figure-plot/recipes/XAFS_Report_Pt_Sample_20260818.docx
+++ b/skills/sci-figure-plot/recipes/XAFS_Report_Pt_Sample_20260818.docx
@@ -25,7 +25,7 @@
     </w:p>
     <w:p>
       <w:r>
-        <w:t>Source: user-provided Athena project Pt-sample.prj containing Pt_sample plus valence standards (Pt foil, PtO, PtO2). Processing chain: pre-edge subtraction and normalization as stored in the project (E0 locked per group); autobk background removal (rbkg = 1.0 A); Fourier transform k-weight 2, k 3.0-11.5 A^-1; single-scattering FEFF path from a Pt-N4 square-planar cluster at 2.02 A (feff6l).</w:t>
+        <w:t>Source: user-provided Athena project Pt-sample.prj containing Pt_sample plus valence standards (Pt foil, PtO, PtO2). Processing chain: pre-edge subtraction and normalization as stored in the project (E0 locked per group); autobk background removal (rbkg = 1.25 A); Fourier transform k-weight 2, k 3.0-11.5 A^-1; three single-scattering FEFF paths: Pt-N @1.98, Pt-C @2.05 (mixed first shell, the report's 'Pt-C/N' made explicit) and C @3.0 second shell.</w:t>
       </w:r>
     </w:p>
     <w:p>
@@ -216,7 +216,7 @@
               <w:rPr>
                 <w:sz w:val="16"/>
               </w:rPr>
-              <w:t>3.5 ± 0.2</w:t>
+              <w:t>2.4 ± 0.5 / 1.3 ± 0.4</w:t>
             </w:r>
           </w:p>
         </w:tc>
@@ -229,7 +229,7 @@
               <w:rPr>
                 <w:sz w:val="16"/>
               </w:rPr>
-              <w:t>1.965 ± 0.017</w:t>
+              <w:t>1.989 (N) / 2.926 (C 2nd)</w:t>
             </w:r>
           </w:p>
         </w:tc>
@@ -242,7 +242,7 @@
               <w:rPr>
                 <w:sz w:val="16"/>
               </w:rPr>
-              <w:t>0.005 ± 0.002</w:t>
+              <w:t>0.0027 / 0.0013</w:t>
             </w:r>
           </w:p>
         </w:tc>
@@ -255,7 +255,7 @@
               <w:rPr>
                 <w:sz w:val="16"/>
               </w:rPr>
-              <w:t>-0.6 ± 3.0</w:t>
+              <w:t>5.5</w:t>
             </w:r>
           </w:p>
         </w:tc>
@@ -268,7 +268,7 @@
               <w:rPr>
                 <w:sz w:val="16"/>
               </w:rPr>
-              <w:t>0.026</w:t>
+              <w:t>0.0169</w:t>
             </w:r>
           </w:p>
         </w:tc>
@@ -535,7 +535,7 @@
               <w:rPr>
                 <w:sz w:val="16"/>
               </w:rPr>
-              <w:t>1.0</w:t>
+              <w:t>1.25</w:t>
             </w:r>
           </w:p>
         </w:tc>
@@ -563,7 +563,7 @@
               <w:rPr>
                 <w:sz w:val="16"/>
               </w:rPr>
-              <w:t>k 3.0–11.5 Å⁻¹, R 1.0–2.2 Å</w:t>
+              <w:t>k 3.0–11.5 Å⁻¹, R 1.0–3.2 Å</w:t>
             </w:r>
           </w:p>
         </w:tc>
@@ -619,7 +619,7 @@
               <w:rPr>
                 <w:sz w:val="16"/>
               </w:rPr>
-              <w:t>Pt-N4 square planar, 2.02 Å (feff6l)</w:t>
+              <w:t>Pt-N@2.02 + C@3.0 two-shell (feff6l)</w:t>
             </w:r>
           </w:p>
         </w:tc>
@@ -647,7 +647,7 @@
               <w:rPr>
                 <w:sz w:val="16"/>
               </w:rPr>
-              <w:t>fitted 0.89</w:t>
+              <w:t>fitted per shell (0.5-1.0 bound)</w:t>
             </w:r>
           </w:p>
         </w:tc>

</xml_diff>